<commit_message>
add the resume in pdf and doc format
</commit_message>
<xml_diff>
--- a/Parag_K_Goyal_Resume.docx
+++ b/Parag_K_Goyal_Resume.docx
@@ -666,7 +666,7 @@
           <w:color w:val="000000"/>
           <w:sz w:val="22"/>
         </w:rPr>
-        <w:t>Shopfic | Java, Spring Boot, Spring MVC, JDBC, MySQL, Maven | GitHub</w:t>
+        <w:t>WhizChat | Java, Spring Boot, PostgreSQL, JPA, WebSocket/STOMP | GitHub</w:t>
       </w:r>
     </w:p>
     <w:p>
@@ -689,7 +689,46 @@
           <w:color w:val="000000"/>
           <w:sz w:val="22"/>
         </w:rPr>
-        <w:t>Built a Java e-commerce application using Spring Boot/Spring MVC and a controller-service-DAO architecture, delivering user and seller onboarding, session-based authentication, catalog search, carts, checkout, and ratings; implemented parameterized JDBC SQL against MySQL with stock validation and inventory decrement on checkout.</w:t>
+        <w:t>Built a real-time messaging application with Spring Boot REST APIs, JPA/PostgreSQL persistence, Keycloak JWT authentication, and WebSocket/STOMP notifications; implemented chats, media uploads, read receipts, and per-user notifications.</w:t>
+      </w:r>
+    </w:p>
+    <w:p>
+      <w:pPr>
+        <w:keepNext/>
+        <w:spacing w:line="270" w:lineRule="exact" w:before="80" w:after="24"/>
+        <w:ind w:left="0" w:firstLine="0"/>
+      </w:pPr>
+      <w:r>
+        <w:rPr>
+          <w:rFonts w:ascii="Arial" w:hAnsi="Arial"/>
+          <w:b/>
+          <w:color w:val="000000"/>
+          <w:sz w:val="22"/>
+        </w:rPr>
+        <w:t>Shopfic | Java, Spring Boot, Spring MVC, JDBC, MySQL | GitHub</w:t>
+      </w:r>
+    </w:p>
+    <w:p>
+      <w:pPr>
+        <w:keepNext w:val="0"/>
+        <w:spacing w:line="274" w:lineRule="exact" w:before="0" w:after="32"/>
+        <w:ind w:left="288" w:hanging="202"/>
+      </w:pPr>
+      <w:r>
+        <w:rPr>
+          <w:rFonts w:ascii="Arial" w:hAnsi="Arial"/>
+          <w:color w:val="000000"/>
+          <w:sz w:val="22"/>
+        </w:rPr>
+        <w:t xml:space="preserve">• </w:t>
+      </w:r>
+      <w:r>
+        <w:rPr>
+          <w:rFonts w:ascii="Arial" w:hAnsi="Arial"/>
+          <w:color w:val="000000"/>
+          <w:sz w:val="22"/>
+        </w:rPr>
+        <w:t>Built a Spring Boot/Spring MVC e-commerce application with session authentication, catalog search, carts, checkout, and JDBC/MySQL data access with inventory validation.</w:t>
       </w:r>
     </w:p>
     <w:p>

</xml_diff>